<commit_message>
Walls - 2026-09-27 16:47
</commit_message>
<xml_diff>
--- a/التعامل مع مشاريع AntiGravity.docx
+++ b/التعامل مع مشاريع AntiGravity.docx
@@ -1,6 +1,6 @@
 
 <file path=word/document.xml><?xml version="1.0" encoding="utf-8"?>
-<w:document xmlns:wpc="http://schemas.microsoft.com/office/word/2010/wordprocessingCanvas" xmlns:cx="http://schemas.microsoft.com/office/drawing/2014/chartex" xmlns:cx1="http://schemas.microsoft.com/office/drawing/2015/9/8/chartex" xmlns:cx2="http://schemas.microsoft.com/office/drawing/2015/10/21/chartex" xmlns:cx3="http://schemas.microsoft.com/office/drawing/2016/5/9/chartex" xmlns:cx4="http://schemas.microsoft.com/office/drawing/2016/5/10/chartex" xmlns:cx5="http://schemas.microsoft.com/office/drawing/2016/5/11/chartex" xmlns:cx6="http://schemas.microsoft.com/office/drawing/2016/5/12/chartex" xmlns:cx7="http://schemas.microsoft.com/office/drawing/2016/5/13/chartex" xmlns:cx8="http://schemas.microsoft.com/office/drawing/2016/5/14/chartex" xmlns:mc="http://schemas.openxmlformats.org/markup-compatibility/2006" xmlns:aink="http://schemas.microsoft.com/office/drawing/2016/ink" xmlns:am3d="http://schemas.microsoft.com/office/drawing/2017/model3d" xmlns:o="urn:schemas-microsoft-com:office:office" xmlns:r="http://schemas.openxmlformats.org/officeDocument/2006/relationships" xmlns:m="http://schemas.openxmlformats.org/officeDocument/2006/math" xmlns:v="urn:schemas-microsoft-com:vml" xmlns:wp14="http://schemas.microsoft.com/office/word/2010/wordprocessingDrawing" xmlns:wp="http://schemas.openxmlformats.org/drawingml/2006/wordprocessingDrawing" xmlns:w10="urn:schemas-microsoft-com:office:word" xmlns:w="http://schemas.openxmlformats.org/wordprocessingml/2006/main" xmlns:w14="http://schemas.microsoft.com/office/word/2010/wordml" xmlns:w15="http://schemas.microsoft.com/office/word/2012/wordml" xmlns:w16cex="http://schemas.microsoft.com/office/word/2018/wordml/cex" xmlns:w16cid="http://schemas.microsoft.com/office/word/2016/wordml/cid" xmlns:w16="http://schemas.microsoft.com/office/word/2018/wordml" xmlns:w16sdtdh="http://schemas.microsoft.com/office/word/2020/wordml/sdtdatahash" xmlns:w16se="http://schemas.microsoft.com/office/word/2015/wordml/symex" xmlns:wpg="http://schemas.microsoft.com/office/word/2010/wordprocessingGroup" xmlns:wpi="http://schemas.microsoft.com/office/word/2010/wordprocessingInk" xmlns:wne="http://schemas.microsoft.com/office/word/2006/wordml" xmlns:wps="http://schemas.microsoft.com/office/word/2010/wordprocessingShape" mc:Ignorable="w14 w15 w16se w16cid w16 w16cex w16sdtdh wp14">
+<w:document xmlns:wpc="http://schemas.microsoft.com/office/word/2010/wordprocessingCanvas" xmlns:cx="http://schemas.microsoft.com/office/drawing/2014/chartex" xmlns:cx1="http://schemas.microsoft.com/office/drawing/2015/9/8/chartex" xmlns:cx2="http://schemas.microsoft.com/office/drawing/2015/10/21/chartex" xmlns:cx3="http://schemas.microsoft.com/office/drawing/2016/5/9/chartex" xmlns:cx4="http://schemas.microsoft.com/office/drawing/2016/5/10/chartex" xmlns:cx5="http://schemas.microsoft.com/office/drawing/2016/5/11/chartex" xmlns:cx6="http://schemas.microsoft.com/office/drawing/2016/5/12/chartex" xmlns:cx7="http://schemas.microsoft.com/office/drawing/2016/5/13/chartex" xmlns:cx8="http://schemas.microsoft.com/office/drawing/2016/5/14/chartex" xmlns:mc="http://schemas.openxmlformats.org/markup-compatibility/2006" xmlns:aink="http://schemas.microsoft.com/office/drawing/2016/ink" xmlns:am3d="http://schemas.microsoft.com/office/drawing/2017/model3d" xmlns:o="urn:schemas-microsoft-com:office:office" xmlns:oel="http://schemas.microsoft.com/office/2019/extlst" xmlns:r="http://schemas.openxmlformats.org/officeDocument/2006/relationships" xmlns:m="http://schemas.openxmlformats.org/officeDocument/2006/math" xmlns:v="urn:schemas-microsoft-com:vml" xmlns:wp14="http://schemas.microsoft.com/office/word/2010/wordprocessingDrawing" xmlns:wp="http://schemas.openxmlformats.org/drawingml/2006/wordprocessingDrawing" xmlns:w10="urn:schemas-microsoft-com:office:word" xmlns:w="http://schemas.openxmlformats.org/wordprocessingml/2006/main" xmlns:w14="http://schemas.microsoft.com/office/word/2010/wordml" xmlns:w15="http://schemas.microsoft.com/office/word/2012/wordml" xmlns:w16cex="http://schemas.microsoft.com/office/word/2018/wordml/cex" xmlns:w16cid="http://schemas.microsoft.com/office/word/2016/wordml/cid" xmlns:w16="http://schemas.microsoft.com/office/word/2018/wordml" xmlns:w16du="http://schemas.microsoft.com/office/word/2023/wordml/word16du" xmlns:w16sdtdh="http://schemas.microsoft.com/office/word/2020/wordml/sdtdatahash" xmlns:w16sdtfl="http://schemas.microsoft.com/office/word/2024/wordml/sdtformatlock" xmlns:w16se="http://schemas.microsoft.com/office/word/2015/wordml/symex" xmlns:wpg="http://schemas.microsoft.com/office/word/2010/wordprocessingGroup" xmlns:wpi="http://schemas.microsoft.com/office/word/2010/wordprocessingInk" xmlns:wne="http://schemas.microsoft.com/office/word/2006/wordml" xmlns:wps="http://schemas.microsoft.com/office/word/2010/wordprocessingShape" mc:Ignorable="w14 w15 w16se w16cid w16 w16cex w16sdtdh w16sdtfl w16du wp14">
   <w:body>
     <w:p>
       <w:pPr>
@@ -1633,28 +1633,27 @@
       </w:r>
     </w:p>
     <w:p>
+      <w:r>
+        <w:rPr>
+          <w:rFonts w:cs="Arial"/>
+          <w:rtl/>
+        </w:rPr>
+        <w:t>*</w:t>
+      </w:r>
+      <w:r>
+        <w:t>Cdqt@7f7o</w:t>
+      </w:r>
+    </w:p>
+    <w:p>
       <w:pPr>
         <w:bidi/>
         <w:jc w:val="right"/>
       </w:pPr>
       <w:r>
-        <w:rPr>
-          <w:rFonts w:hint="cs"/>
-          <w:rtl/>
-        </w:rPr>
-        <w:t xml:space="preserve">تم تغييره كما في </w:t>
-      </w:r>
-      <w:r>
-        <w:t>1 pass</w:t>
-      </w:r>
-    </w:p>
-    <w:p>
-      <w:pPr>
-        <w:bidi/>
-        <w:jc w:val="right"/>
-      </w:pPr>
-      <w:r>
         <w:t>hzayed1010@gmail</w:t>
+      </w:r>
+      <w:r>
+        <w:t>.com</w:t>
       </w:r>
     </w:p>
     <w:p>
@@ -1824,7 +1823,6 @@
         <w:bidi/>
         <w:jc w:val="right"/>
         <w:rPr>
-          <w:rFonts w:hint="cs"/>
           <w:rtl/>
           <w:lang w:bidi="ar-EG"/>
         </w:rPr>
@@ -1923,19 +1921,7 @@
           <w:szCs w:val="21"/>
           <w:shd w:val="clear" w:color="auto" w:fill="FFFFFF"/>
         </w:rPr>
-        <w:t>Repository name</w:t>
-      </w:r>
-      <w:r>
-        <w:rPr>
-          <w:rFonts w:ascii="Segoe UI" w:hAnsi="Segoe UI" w:cs="Segoe UI"/>
-          <w:b/>
-          <w:bCs/>
-          <w:color w:val="1F2328"/>
-          <w:sz w:val="21"/>
-          <w:szCs w:val="21"/>
-          <w:shd w:val="clear" w:color="auto" w:fill="FFFFFF"/>
-        </w:rPr>
-        <w:t xml:space="preserve"> : </w:t>
+        <w:t xml:space="preserve">Repository name : </w:t>
       </w:r>
       <w:r>
         <w:rPr>
@@ -2171,7 +2157,6 @@
     <w:p>
       <w:pPr>
         <w:rPr>
-          <w:rFonts w:hint="cs"/>
           <w:rtl/>
           <w:lang w:bidi="ar-EG"/>
         </w:rPr>
@@ -2562,17 +2547,15 @@
     <w:p>
       <w:pPr>
         <w:rPr>
-          <w:rFonts w:hint="cs"/>
-          <w:rtl/>
-          <w:lang w:bidi="ar-EG"/>
-        </w:rPr>
-      </w:pPr>
-    </w:p>
-    <w:p>
-      <w:pPr>
-        <w:bidi/>
-        <w:rPr>
-          <w:rFonts w:hint="cs"/>
+          <w:rtl/>
+          <w:lang w:bidi="ar-EG"/>
+        </w:rPr>
+      </w:pPr>
+    </w:p>
+    <w:p>
+      <w:pPr>
+        <w:bidi/>
+        <w:rPr>
           <w:lang w:bidi="ar-EG"/>
         </w:rPr>
       </w:pPr>
@@ -2596,7 +2579,7 @@
 </file>
 
 <file path=word/numbering.xml><?xml version="1.0" encoding="utf-8"?>
-<w:numbering xmlns:wpc="http://schemas.microsoft.com/office/word/2010/wordprocessingCanvas" xmlns:cx="http://schemas.microsoft.com/office/drawing/2014/chartex" xmlns:cx1="http://schemas.microsoft.com/office/drawing/2015/9/8/chartex" xmlns:cx2="http://schemas.microsoft.com/office/drawing/2015/10/21/chartex" xmlns:cx3="http://schemas.microsoft.com/office/drawing/2016/5/9/chartex" xmlns:cx4="http://schemas.microsoft.com/office/drawing/2016/5/10/chartex" xmlns:cx5="http://schemas.microsoft.com/office/drawing/2016/5/11/chartex" xmlns:cx6="http://schemas.microsoft.com/office/drawing/2016/5/12/chartex" xmlns:cx7="http://schemas.microsoft.com/office/drawing/2016/5/13/chartex" xmlns:cx8="http://schemas.microsoft.com/office/drawing/2016/5/14/chartex" xmlns:mc="http://schemas.openxmlformats.org/markup-compatibility/2006" xmlns:aink="http://schemas.microsoft.com/office/drawing/2016/ink" xmlns:am3d="http://schemas.microsoft.com/office/drawing/2017/model3d" xmlns:o="urn:schemas-microsoft-com:office:office" xmlns:r="http://schemas.openxmlformats.org/officeDocument/2006/relationships" xmlns:m="http://schemas.openxmlformats.org/officeDocument/2006/math" xmlns:v="urn:schemas-microsoft-com:vml" xmlns:wp14="http://schemas.microsoft.com/office/word/2010/wordprocessingDrawing" xmlns:wp="http://schemas.openxmlformats.org/drawingml/2006/wordprocessingDrawing" xmlns:w10="urn:schemas-microsoft-com:office:word" xmlns:w="http://schemas.openxmlformats.org/wordprocessingml/2006/main" xmlns:w14="http://schemas.microsoft.com/office/word/2010/wordml" xmlns:w15="http://schemas.microsoft.com/office/word/2012/wordml" xmlns:w16cex="http://schemas.microsoft.com/office/word/2018/wordml/cex" xmlns:w16cid="http://schemas.microsoft.com/office/word/2016/wordml/cid" xmlns:w16="http://schemas.microsoft.com/office/word/2018/wordml" xmlns:w16sdtdh="http://schemas.microsoft.com/office/word/2020/wordml/sdtdatahash" xmlns:w16se="http://schemas.microsoft.com/office/word/2015/wordml/symex" xmlns:wpg="http://schemas.microsoft.com/office/word/2010/wordprocessingGroup" xmlns:wpi="http://schemas.microsoft.com/office/word/2010/wordprocessingInk" xmlns:wne="http://schemas.microsoft.com/office/word/2006/wordml" xmlns:wps="http://schemas.microsoft.com/office/word/2010/wordprocessingShape" mc:Ignorable="w14 w15 w16se w16cid w16 w16cex w16sdtdh wp14">
+<w:numbering xmlns:wpc="http://schemas.microsoft.com/office/word/2010/wordprocessingCanvas" xmlns:cx="http://schemas.microsoft.com/office/drawing/2014/chartex" xmlns:cx1="http://schemas.microsoft.com/office/drawing/2015/9/8/chartex" xmlns:cx2="http://schemas.microsoft.com/office/drawing/2015/10/21/chartex" xmlns:cx3="http://schemas.microsoft.com/office/drawing/2016/5/9/chartex" xmlns:cx4="http://schemas.microsoft.com/office/drawing/2016/5/10/chartex" xmlns:cx5="http://schemas.microsoft.com/office/drawing/2016/5/11/chartex" xmlns:cx6="http://schemas.microsoft.com/office/drawing/2016/5/12/chartex" xmlns:cx7="http://schemas.microsoft.com/office/drawing/2016/5/13/chartex" xmlns:cx8="http://schemas.microsoft.com/office/drawing/2016/5/14/chartex" xmlns:mc="http://schemas.openxmlformats.org/markup-compatibility/2006" xmlns:aink="http://schemas.microsoft.com/office/drawing/2016/ink" xmlns:am3d="http://schemas.microsoft.com/office/drawing/2017/model3d" xmlns:o="urn:schemas-microsoft-com:office:office" xmlns:oel="http://schemas.microsoft.com/office/2019/extlst" xmlns:r="http://schemas.openxmlformats.org/officeDocument/2006/relationships" xmlns:m="http://schemas.openxmlformats.org/officeDocument/2006/math" xmlns:v="urn:schemas-microsoft-com:vml" xmlns:wp14="http://schemas.microsoft.com/office/word/2010/wordprocessingDrawing" xmlns:wp="http://schemas.openxmlformats.org/drawingml/2006/wordprocessingDrawing" xmlns:w10="urn:schemas-microsoft-com:office:word" xmlns:w="http://schemas.openxmlformats.org/wordprocessingml/2006/main" xmlns:w14="http://schemas.microsoft.com/office/word/2010/wordml" xmlns:w15="http://schemas.microsoft.com/office/word/2012/wordml" xmlns:w16cex="http://schemas.microsoft.com/office/word/2018/wordml/cex" xmlns:w16cid="http://schemas.microsoft.com/office/word/2016/wordml/cid" xmlns:w16="http://schemas.microsoft.com/office/word/2018/wordml" xmlns:w16du="http://schemas.microsoft.com/office/word/2023/wordml/word16du" xmlns:w16sdtdh="http://schemas.microsoft.com/office/word/2020/wordml/sdtdatahash" xmlns:w16sdtfl="http://schemas.microsoft.com/office/word/2024/wordml/sdtformatlock" xmlns:w16se="http://schemas.microsoft.com/office/word/2015/wordml/symex" xmlns:wpg="http://schemas.microsoft.com/office/word/2010/wordprocessingGroup" xmlns:wpi="http://schemas.microsoft.com/office/word/2010/wordprocessingInk" xmlns:wne="http://schemas.microsoft.com/office/word/2006/wordml" xmlns:wps="http://schemas.microsoft.com/office/word/2010/wordprocessingShape" mc:Ignorable="w14 w15 w16se w16cid w16 w16cex w16sdtdh w16sdtfl w16du wp14">
   <w:abstractNum w:abstractNumId="0" w15:restartNumberingAfterBreak="0">
     <w:nsid w:val="12E74F33"/>
     <w:multiLevelType w:val="hybridMultilevel"/>
@@ -2710,14 +2693,14 @@
       </w:rPr>
     </w:lvl>
   </w:abstractNum>
-  <w:num w:numId="1">
+  <w:num w:numId="1" w16cid:durableId="1746298648">
     <w:abstractNumId w:val="0"/>
   </w:num>
 </w:numbering>
 </file>
 
 <file path=word/styles.xml><?xml version="1.0" encoding="utf-8"?>
-<w:styles xmlns:mc="http://schemas.openxmlformats.org/markup-compatibility/2006" xmlns:r="http://schemas.openxmlformats.org/officeDocument/2006/relationships" xmlns:w="http://schemas.openxmlformats.org/wordprocessingml/2006/main" xmlns:w14="http://schemas.microsoft.com/office/word/2010/wordml" xmlns:w15="http://schemas.microsoft.com/office/word/2012/wordml" xmlns:w16cex="http://schemas.microsoft.com/office/word/2018/wordml/cex" xmlns:w16cid="http://schemas.microsoft.com/office/word/2016/wordml/cid" xmlns:w16="http://schemas.microsoft.com/office/word/2018/wordml" xmlns:w16sdtdh="http://schemas.microsoft.com/office/word/2020/wordml/sdtdatahash" xmlns:w16se="http://schemas.microsoft.com/office/word/2015/wordml/symex" mc:Ignorable="w14 w15 w16se w16cid w16 w16cex w16sdtdh">
+<w:styles xmlns:mc="http://schemas.openxmlformats.org/markup-compatibility/2006" xmlns:r="http://schemas.openxmlformats.org/officeDocument/2006/relationships" xmlns:w="http://schemas.openxmlformats.org/wordprocessingml/2006/main" xmlns:w14="http://schemas.microsoft.com/office/word/2010/wordml" xmlns:w15="http://schemas.microsoft.com/office/word/2012/wordml" xmlns:w16cex="http://schemas.microsoft.com/office/word/2018/wordml/cex" xmlns:w16cid="http://schemas.microsoft.com/office/word/2016/wordml/cid" xmlns:w16="http://schemas.microsoft.com/office/word/2018/wordml" xmlns:w16du="http://schemas.microsoft.com/office/word/2023/wordml/word16du" xmlns:w16sdtdh="http://schemas.microsoft.com/office/word/2020/wordml/sdtdatahash" xmlns:w16sdtfl="http://schemas.microsoft.com/office/word/2024/wordml/sdtformatlock" xmlns:w16se="http://schemas.microsoft.com/office/word/2015/wordml/symex" mc:Ignorable="w14 w15 w16se w16cid w16 w16cex w16sdtdh w16sdtfl w16du">
   <w:docDefaults>
     <w:rPrDefault>
       <w:rPr>

</xml_diff>

<commit_message>
3D viewer - 2026-10-21 23:21
</commit_message>
<xml_diff>
--- a/التعامل مع مشاريع AntiGravity.docx
+++ b/التعامل مع مشاريع AntiGravity.docx
@@ -1,6 +1,6 @@
 
 <file path=word/document.xml><?xml version="1.0" encoding="utf-8"?>
-<w:document xmlns:wpc="http://schemas.microsoft.com/office/word/2010/wordprocessingCanvas" xmlns:cx="http://schemas.microsoft.com/office/drawing/2014/chartex" xmlns:cx1="http://schemas.microsoft.com/office/drawing/2015/9/8/chartex" xmlns:cx2="http://schemas.microsoft.com/office/drawing/2015/10/21/chartex" xmlns:cx3="http://schemas.microsoft.com/office/drawing/2016/5/9/chartex" xmlns:cx4="http://schemas.microsoft.com/office/drawing/2016/5/10/chartex" xmlns:cx5="http://schemas.microsoft.com/office/drawing/2016/5/11/chartex" xmlns:cx6="http://schemas.microsoft.com/office/drawing/2016/5/12/chartex" xmlns:cx7="http://schemas.microsoft.com/office/drawing/2016/5/13/chartex" xmlns:cx8="http://schemas.microsoft.com/office/drawing/2016/5/14/chartex" xmlns:mc="http://schemas.openxmlformats.org/markup-compatibility/2006" xmlns:aink="http://schemas.microsoft.com/office/drawing/2016/ink" xmlns:am3d="http://schemas.microsoft.com/office/drawing/2017/model3d" xmlns:o="urn:schemas-microsoft-com:office:office" xmlns:oel="http://schemas.microsoft.com/office/2019/extlst" xmlns:r="http://schemas.openxmlformats.org/officeDocument/2006/relationships" xmlns:m="http://schemas.openxmlformats.org/officeDocument/2006/math" xmlns:v="urn:schemas-microsoft-com:vml" xmlns:wp14="http://schemas.microsoft.com/office/word/2010/wordprocessingDrawing" xmlns:wp="http://schemas.openxmlformats.org/drawingml/2006/wordprocessingDrawing" xmlns:w10="urn:schemas-microsoft-com:office:word" xmlns:w="http://schemas.openxmlformats.org/wordprocessingml/2006/main" xmlns:w14="http://schemas.microsoft.com/office/word/2010/wordml" xmlns:w15="http://schemas.microsoft.com/office/word/2012/wordml" xmlns:w16cex="http://schemas.microsoft.com/office/word/2018/wordml/cex" xmlns:w16cid="http://schemas.microsoft.com/office/word/2016/wordml/cid" xmlns:w16="http://schemas.microsoft.com/office/word/2018/wordml" xmlns:w16du="http://schemas.microsoft.com/office/word/2023/wordml/word16du" xmlns:w16sdtdh="http://schemas.microsoft.com/office/word/2020/wordml/sdtdatahash" xmlns:w16sdtfl="http://schemas.microsoft.com/office/word/2024/wordml/sdtformatlock" xmlns:w16se="http://schemas.microsoft.com/office/word/2015/wordml/symex" xmlns:wpg="http://schemas.microsoft.com/office/word/2010/wordprocessingGroup" xmlns:wpi="http://schemas.microsoft.com/office/word/2010/wordprocessingInk" xmlns:wne="http://schemas.microsoft.com/office/word/2006/wordml" xmlns:wps="http://schemas.microsoft.com/office/word/2010/wordprocessingShape" mc:Ignorable="w14 w15 w16se w16cid w16 w16cex w16sdtdh w16sdtfl w16du wp14">
+<w:document xmlns:wpc="http://schemas.microsoft.com/office/word/2010/wordprocessingCanvas" xmlns:cx="http://schemas.microsoft.com/office/drawing/2014/chartex" xmlns:cx1="http://schemas.microsoft.com/office/drawing/2015/9/8/chartex" xmlns:cx2="http://schemas.microsoft.com/office/drawing/2015/10/21/chartex" xmlns:cx3="http://schemas.microsoft.com/office/drawing/2016/5/9/chartex" xmlns:cx4="http://schemas.microsoft.com/office/drawing/2016/5/10/chartex" xmlns:cx5="http://schemas.microsoft.com/office/drawing/2016/5/11/chartex" xmlns:cx6="http://schemas.microsoft.com/office/drawing/2016/5/12/chartex" xmlns:cx7="http://schemas.microsoft.com/office/drawing/2016/5/13/chartex" xmlns:cx8="http://schemas.microsoft.com/office/drawing/2016/5/14/chartex" xmlns:mc="http://schemas.openxmlformats.org/markup-compatibility/2006" xmlns:aink="http://schemas.microsoft.com/office/drawing/2016/ink" xmlns:am3d="http://schemas.microsoft.com/office/drawing/2017/model3d" xmlns:o="urn:schemas-microsoft-com:office:office" xmlns:r="http://schemas.openxmlformats.org/officeDocument/2006/relationships" xmlns:m="http://schemas.openxmlformats.org/officeDocument/2006/math" xmlns:v="urn:schemas-microsoft-com:vml" xmlns:wp14="http://schemas.microsoft.com/office/word/2010/wordprocessingDrawing" xmlns:wp="http://schemas.openxmlformats.org/drawingml/2006/wordprocessingDrawing" xmlns:w10="urn:schemas-microsoft-com:office:word" xmlns:w="http://schemas.openxmlformats.org/wordprocessingml/2006/main" xmlns:w14="http://schemas.microsoft.com/office/word/2010/wordml" xmlns:w15="http://schemas.microsoft.com/office/word/2012/wordml" xmlns:w16cex="http://schemas.microsoft.com/office/word/2018/wordml/cex" xmlns:w16cid="http://schemas.microsoft.com/office/word/2016/wordml/cid" xmlns:w16="http://schemas.microsoft.com/office/word/2018/wordml" xmlns:w16sdtdh="http://schemas.microsoft.com/office/word/2020/wordml/sdtdatahash" xmlns:w16se="http://schemas.microsoft.com/office/word/2015/wordml/symex" xmlns:wpg="http://schemas.microsoft.com/office/word/2010/wordprocessingGroup" xmlns:wpi="http://schemas.microsoft.com/office/word/2010/wordprocessingInk" xmlns:wne="http://schemas.microsoft.com/office/word/2006/wordml" xmlns:wps="http://schemas.microsoft.com/office/word/2010/wordprocessingShape" mc:Ignorable="w14 w15 w16se w16cid w16 w16cex w16sdtdh wp14">
   <w:body>
     <w:p>
       <w:pPr>
@@ -663,7 +663,20 @@
           <w:u w:val="single"/>
           <w:lang w:bidi="ar-EG"/>
         </w:rPr>
-        <w:t>git add</w:t>
+        <w:t xml:space="preserve">git </w:t>
+      </w:r>
+      <w:proofErr w:type="gramStart"/>
+      <w:r>
+        <w:rPr>
+          <w:b/>
+          <w:bCs/>
+          <w:color w:val="0070C0"/>
+          <w:sz w:val="28"/>
+          <w:szCs w:val="28"/>
+          <w:u w:val="single"/>
+          <w:lang w:bidi="ar-EG"/>
+        </w:rPr>
+        <w:t>add</w:t>
       </w:r>
       <w:r>
         <w:rPr>
@@ -679,6 +692,7 @@
         </w:rPr>
         <w:t xml:space="preserve"> .</w:t>
       </w:r>
+      <w:proofErr w:type="gramEnd"/>
     </w:p>
     <w:p>
       <w:pPr>
@@ -939,7 +953,7 @@
               </wp:anchor>
             </w:drawing>
           </mc:Choice>
-          <mc:Fallback>
+          <mc:Fallback xmlns:w16sdtfl="http://schemas.microsoft.com/office/word/2024/wordml/sdtformatlock" xmlns:w16du="http://schemas.microsoft.com/office/word/2023/wordml/word16du" xmlns:oel="http://schemas.microsoft.com/office/2019/extlst">
             <w:pict>
               <v:line w14:anchorId="634E005A" id="Straight Connector 4" o:spid="_x0000_s1026" style="position:absolute;flip:x;z-index:251663360;visibility:visible;mso-wrap-style:square;mso-wrap-distance-left:9pt;mso-wrap-distance-top:0;mso-wrap-distance-right:9pt;mso-wrap-distance-bottom:0;mso-position-horizontal:absolute;mso-position-horizontal-relative:text;mso-position-vertical:absolute;mso-position-vertical-relative:text" from="76pt,80.6pt" to="181.85pt,81pt" o:gfxdata="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" strokecolor="red" strokeweight="3pt">
                 <v:stroke joinstyle="miter"/>
@@ -1007,7 +1021,7 @@
               </wp:anchor>
             </w:drawing>
           </mc:Choice>
-          <mc:Fallback>
+          <mc:Fallback xmlns:w16sdtfl="http://schemas.microsoft.com/office/word/2024/wordml/sdtformatlock" xmlns:w16du="http://schemas.microsoft.com/office/word/2023/wordml/word16du" xmlns:oel="http://schemas.microsoft.com/office/2019/extlst">
             <w:pict>
               <v:line w14:anchorId="598D8565" id="Straight Connector 3" o:spid="_x0000_s1026" style="position:absolute;flip:x;z-index:251661312;visibility:visible;mso-wrap-style:square;mso-wrap-distance-left:9pt;mso-wrap-distance-top:0;mso-wrap-distance-right:9pt;mso-wrap-distance-bottom:0;mso-position-horizontal:absolute;mso-position-horizontal-relative:text;mso-position-vertical:absolute;mso-position-vertical-relative:text" from="1.9pt,64.35pt" to="107.75pt,64.75pt" o:gfxdata="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" strokecolor="red" strokeweight="3pt">
                 <v:stroke joinstyle="miter"/>
@@ -1075,7 +1089,7 @@
               </wp:anchor>
             </w:drawing>
           </mc:Choice>
-          <mc:Fallback>
+          <mc:Fallback xmlns:w16sdtfl="http://schemas.microsoft.com/office/word/2024/wordml/sdtformatlock" xmlns:w16du="http://schemas.microsoft.com/office/word/2023/wordml/word16du" xmlns:oel="http://schemas.microsoft.com/office/2019/extlst">
             <w:pict>
               <v:line w14:anchorId="22450190" id="Straight Connector 2" o:spid="_x0000_s1026" style="position:absolute;flip:x;z-index:251659264;visibility:visible;mso-wrap-style:square;mso-wrap-distance-left:9pt;mso-wrap-distance-top:0;mso-wrap-distance-right:9pt;mso-wrap-distance-bottom:0;mso-position-horizontal:absolute;mso-position-horizontal-relative:text;mso-position-vertical:absolute;mso-position-vertical-relative:text" from="5.55pt,124.6pt" to="111.4pt,125.05pt" o:gfxdata="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" strokecolor="red" strokeweight="3pt">
                 <v:stroke joinstyle="miter"/>
@@ -1443,17 +1457,39 @@
           <w:szCs w:val="24"/>
           <w:lang w:bidi="ar-EG"/>
         </w:rPr>
-        <w:t xml:space="preserve">         </w:t>
-      </w:r>
-      <w:r>
-        <w:rPr>
-          <w:b/>
-          <w:bCs/>
-          <w:sz w:val="24"/>
-          <w:szCs w:val="24"/>
-          <w:lang w:bidi="ar-EG"/>
-        </w:rPr>
-        <w:t xml:space="preserve">( </w:t>
+        <w:t xml:space="preserve">      </w:t>
+      </w:r>
+      <w:proofErr w:type="gramStart"/>
+      <w:r>
+        <w:rPr>
+          <w:b/>
+          <w:bCs/>
+          <w:sz w:val="24"/>
+          <w:szCs w:val="24"/>
+          <w:lang w:bidi="ar-EG"/>
+        </w:rPr>
+        <w:t xml:space="preserve">   </w:t>
+      </w:r>
+      <w:r>
+        <w:rPr>
+          <w:b/>
+          <w:bCs/>
+          <w:sz w:val="24"/>
+          <w:szCs w:val="24"/>
+          <w:lang w:bidi="ar-EG"/>
+        </w:rPr>
+        <w:t>(</w:t>
+      </w:r>
+      <w:proofErr w:type="gramEnd"/>
+      <w:r>
+        <w:rPr>
+          <w:b/>
+          <w:bCs/>
+          <w:sz w:val="24"/>
+          <w:szCs w:val="24"/>
+          <w:lang w:bidi="ar-EG"/>
+        </w:rPr>
+        <w:t xml:space="preserve"> </w:t>
       </w:r>
       <w:r>
         <w:rPr>
@@ -1505,17 +1541,39 @@
           <w:szCs w:val="24"/>
           <w:lang w:bidi="ar-EG"/>
         </w:rPr>
-        <w:t xml:space="preserve">     </w:t>
-      </w:r>
-      <w:r>
-        <w:rPr>
-          <w:b/>
-          <w:bCs/>
-          <w:sz w:val="24"/>
-          <w:szCs w:val="24"/>
-          <w:lang w:bidi="ar-EG"/>
-        </w:rPr>
-        <w:t>(+)</w:t>
+        <w:t xml:space="preserve">  </w:t>
+      </w:r>
+      <w:proofErr w:type="gramStart"/>
+      <w:r>
+        <w:rPr>
+          <w:b/>
+          <w:bCs/>
+          <w:sz w:val="24"/>
+          <w:szCs w:val="24"/>
+          <w:lang w:bidi="ar-EG"/>
+        </w:rPr>
+        <w:t xml:space="preserve">   </w:t>
+      </w:r>
+      <w:r>
+        <w:rPr>
+          <w:b/>
+          <w:bCs/>
+          <w:sz w:val="24"/>
+          <w:szCs w:val="24"/>
+          <w:lang w:bidi="ar-EG"/>
+        </w:rPr>
+        <w:t>(</w:t>
+      </w:r>
+      <w:proofErr w:type="gramEnd"/>
+      <w:r>
+        <w:rPr>
+          <w:b/>
+          <w:bCs/>
+          <w:sz w:val="24"/>
+          <w:szCs w:val="24"/>
+          <w:lang w:bidi="ar-EG"/>
+        </w:rPr>
+        <w:t>+)</w:t>
       </w:r>
       <w:r>
         <w:rPr>
@@ -1921,7 +1979,33 @@
           <w:szCs w:val="21"/>
           <w:shd w:val="clear" w:color="auto" w:fill="FFFFFF"/>
         </w:rPr>
-        <w:t xml:space="preserve">Repository name : </w:t>
+        <w:t xml:space="preserve">Repository </w:t>
+      </w:r>
+      <w:proofErr w:type="gramStart"/>
+      <w:r>
+        <w:rPr>
+          <w:rFonts w:ascii="Segoe UI" w:hAnsi="Segoe UI" w:cs="Segoe UI"/>
+          <w:b/>
+          <w:bCs/>
+          <w:color w:val="1F2328"/>
+          <w:sz w:val="21"/>
+          <w:szCs w:val="21"/>
+          <w:shd w:val="clear" w:color="auto" w:fill="FFFFFF"/>
+        </w:rPr>
+        <w:t>name :</w:t>
+      </w:r>
+      <w:proofErr w:type="gramEnd"/>
+      <w:r>
+        <w:rPr>
+          <w:rFonts w:ascii="Segoe UI" w:hAnsi="Segoe UI" w:cs="Segoe UI"/>
+          <w:b/>
+          <w:bCs/>
+          <w:color w:val="1F2328"/>
+          <w:sz w:val="21"/>
+          <w:szCs w:val="21"/>
+          <w:shd w:val="clear" w:color="auto" w:fill="FFFFFF"/>
+        </w:rPr>
+        <w:t xml:space="preserve"> </w:t>
       </w:r>
       <w:r>
         <w:rPr>
@@ -2341,7 +2425,20 @@
           <w:u w:val="single"/>
           <w:lang w:bidi="ar-EG"/>
         </w:rPr>
-        <w:t>git add</w:t>
+        <w:t xml:space="preserve">git </w:t>
+      </w:r>
+      <w:proofErr w:type="gramStart"/>
+      <w:r>
+        <w:rPr>
+          <w:b/>
+          <w:bCs/>
+          <w:color w:val="0070C0"/>
+          <w:sz w:val="28"/>
+          <w:szCs w:val="28"/>
+          <w:u w:val="single"/>
+          <w:lang w:bidi="ar-EG"/>
+        </w:rPr>
+        <w:t>add</w:t>
       </w:r>
       <w:r>
         <w:rPr>
@@ -2357,6 +2454,7 @@
         </w:rPr>
         <w:t xml:space="preserve"> .</w:t>
       </w:r>
+      <w:proofErr w:type="gramEnd"/>
     </w:p>
     <w:p>
       <w:pPr>
@@ -2546,8 +2644,905 @@
     </w:p>
     <w:p>
       <w:pPr>
-        <w:rPr>
-          <w:rtl/>
+        <w:bidi/>
+        <w:jc w:val="center"/>
+        <w:rPr>
+          <w:b/>
+          <w:bCs/>
+          <w:sz w:val="28"/>
+          <w:szCs w:val="28"/>
+          <w:u w:val="single"/>
+          <w:lang w:bidi="ar-EG"/>
+        </w:rPr>
+      </w:pPr>
+      <w:r>
+        <w:rPr>
+          <w:rFonts w:hint="cs"/>
+          <w:b/>
+          <w:bCs/>
+          <w:sz w:val="28"/>
+          <w:szCs w:val="28"/>
+          <w:highlight w:val="yellow"/>
+          <w:u w:val="single"/>
+          <w:rtl/>
+          <w:lang w:bidi="ar-EG"/>
+        </w:rPr>
+        <w:t xml:space="preserve">طريقة عمل </w:t>
+      </w:r>
+      <w:r>
+        <w:rPr>
+          <w:b/>
+          <w:bCs/>
+          <w:sz w:val="28"/>
+          <w:szCs w:val="28"/>
+          <w:highlight w:val="yellow"/>
+          <w:u w:val="single"/>
+          <w:lang w:bidi="ar-EG"/>
+        </w:rPr>
+        <w:t>Git pull &amp; Git clone</w:t>
+      </w:r>
+    </w:p>
+    <w:p>
+      <w:pPr>
+        <w:bidi/>
+        <w:spacing w:after="0" w:line="240" w:lineRule="auto"/>
+        <w:jc w:val="center"/>
+        <w:rPr>
+          <w:b/>
+          <w:bCs/>
+          <w:sz w:val="40"/>
+          <w:szCs w:val="40"/>
+          <w:u w:val="single"/>
+          <w:lang w:bidi="ar-EG"/>
+        </w:rPr>
+      </w:pPr>
+      <w:r>
+        <w:rPr>
+          <w:b/>
+          <w:bCs/>
+          <w:sz w:val="40"/>
+          <w:szCs w:val="40"/>
+          <w:highlight w:val="green"/>
+          <w:u w:val="single"/>
+          <w:lang w:bidi="ar-EG"/>
+        </w:rPr>
+        <w:t xml:space="preserve">Git </w:t>
+      </w:r>
+      <w:proofErr w:type="gramStart"/>
+      <w:r>
+        <w:rPr>
+          <w:b/>
+          <w:bCs/>
+          <w:sz w:val="40"/>
+          <w:szCs w:val="40"/>
+          <w:highlight w:val="green"/>
+          <w:u w:val="single"/>
+          <w:lang w:bidi="ar-EG"/>
+        </w:rPr>
+        <w:t>pull</w:t>
+      </w:r>
+      <w:proofErr w:type="gramEnd"/>
+    </w:p>
+    <w:p>
+      <w:pPr>
+        <w:bidi/>
+        <w:spacing w:after="0" w:line="240" w:lineRule="auto"/>
+        <w:rPr>
+          <w:rtl/>
+          <w:lang w:bidi="ar-EG"/>
+        </w:rPr>
+      </w:pPr>
+      <w:r>
+        <w:rPr>
+          <w:rFonts w:hint="cs"/>
+          <w:rtl/>
+          <w:lang w:bidi="ar-EG"/>
+        </w:rPr>
+        <w:t xml:space="preserve">توضيح : يتم عمل </w:t>
+      </w:r>
+      <w:r>
+        <w:rPr>
+          <w:lang w:bidi="ar-EG"/>
+        </w:rPr>
+        <w:t>Git pull</w:t>
+      </w:r>
+      <w:r>
+        <w:rPr>
+          <w:rFonts w:hint="cs"/>
+          <w:rtl/>
+          <w:lang w:bidi="ar-EG"/>
+        </w:rPr>
+        <w:t xml:space="preserve"> اذا تم عمل تحديث او شغل علي جهاز وتم رفعه علي </w:t>
+      </w:r>
+      <w:r>
+        <w:rPr>
+          <w:lang w:bidi="ar-EG"/>
+        </w:rPr>
+        <w:t>Git Hub</w:t>
+      </w:r>
+      <w:r>
+        <w:rPr>
+          <w:rFonts w:hint="cs"/>
+          <w:rtl/>
+          <w:lang w:bidi="ar-EG"/>
+        </w:rPr>
+        <w:t xml:space="preserve">   ومحتاج سحب هذه التحديثات علي جهاز اخر </w:t>
+      </w:r>
+    </w:p>
+    <w:p>
+      <w:pPr>
+        <w:bidi/>
+        <w:spacing w:after="0" w:line="240" w:lineRule="auto"/>
+        <w:ind w:left="2160"/>
+        <w:rPr>
+          <w:rFonts w:hint="cs"/>
+          <w:b/>
+          <w:bCs/>
+          <w:sz w:val="32"/>
+          <w:szCs w:val="32"/>
+          <w:u w:val="single"/>
+          <w:rtl/>
+        </w:rPr>
+      </w:pPr>
+      <w:r>
+        <w:rPr>
+          <w:rtl/>
+          <w:lang w:bidi="ar-EG"/>
+        </w:rPr>
+        <w:br/>
+      </w:r>
+      <w:r>
+        <w:rPr>
+          <w:rFonts w:hint="cs"/>
+          <w:b/>
+          <w:bCs/>
+          <w:sz w:val="32"/>
+          <w:szCs w:val="32"/>
+          <w:u w:val="single"/>
+          <w:rtl/>
+        </w:rPr>
+        <w:t>خطأ غالبا ما يظهر:-</w:t>
+      </w:r>
+    </w:p>
+    <w:p>
+      <w:pPr>
+        <w:bidi/>
+        <w:spacing w:after="0" w:line="240" w:lineRule="auto"/>
+        <w:rPr>
+          <w:lang w:bidi="ar-EG"/>
+        </w:rPr>
+      </w:pPr>
+      <w:r>
+        <w:rPr>
+          <w:lang w:bidi="ar-EG"/>
+        </w:rPr>
+        <w:t>E:\Concrete design&gt;git pull</w:t>
+      </w:r>
+    </w:p>
+    <w:p>
+      <w:pPr>
+        <w:bidi/>
+        <w:spacing w:after="0" w:line="240" w:lineRule="auto"/>
+        <w:rPr>
+          <w:lang w:bidi="ar-EG"/>
+        </w:rPr>
+      </w:pPr>
+      <w:r>
+        <w:rPr>
+          <w:lang w:bidi="ar-EG"/>
+        </w:rPr>
+        <w:t>remote: Enumerating objects: 19, done.</w:t>
+      </w:r>
+    </w:p>
+    <w:p>
+      <w:pPr>
+        <w:bidi/>
+        <w:spacing w:after="0" w:line="240" w:lineRule="auto"/>
+        <w:rPr>
+          <w:lang w:bidi="ar-EG"/>
+        </w:rPr>
+      </w:pPr>
+      <w:r>
+        <w:rPr>
+          <w:lang w:bidi="ar-EG"/>
+        </w:rPr>
+        <w:t>remote: Counting objects: 100% (19/19), done.</w:t>
+      </w:r>
+    </w:p>
+    <w:p>
+      <w:pPr>
+        <w:bidi/>
+        <w:spacing w:after="0" w:line="240" w:lineRule="auto"/>
+        <w:rPr>
+          <w:lang w:bidi="ar-EG"/>
+        </w:rPr>
+      </w:pPr>
+      <w:r>
+        <w:rPr>
+          <w:lang w:bidi="ar-EG"/>
+        </w:rPr>
+        <w:t>remote: Compressing objects: 100% (1/1), done.</w:t>
+      </w:r>
+    </w:p>
+    <w:p>
+      <w:pPr>
+        <w:bidi/>
+        <w:spacing w:after="0" w:line="240" w:lineRule="auto"/>
+        <w:rPr>
+          <w:lang w:bidi="ar-EG"/>
+        </w:rPr>
+      </w:pPr>
+      <w:r>
+        <w:rPr>
+          <w:lang w:bidi="ar-EG"/>
+        </w:rPr>
+        <w:t>remote: Total 10 (delta 9), reused 10 (delta 9), pack-reused 0 (from 0)</w:t>
+      </w:r>
+    </w:p>
+    <w:p>
+      <w:pPr>
+        <w:bidi/>
+        <w:spacing w:after="0" w:line="240" w:lineRule="auto"/>
+        <w:rPr>
+          <w:lang w:bidi="ar-EG"/>
+        </w:rPr>
+      </w:pPr>
+      <w:r>
+        <w:rPr>
+          <w:lang w:bidi="ar-EG"/>
+        </w:rPr>
+        <w:t>Unpacking objects: 100% (10/10), 127.81 KiB | 114.00 KiB/s, done.</w:t>
+      </w:r>
+    </w:p>
+    <w:p>
+      <w:pPr>
+        <w:bidi/>
+        <w:spacing w:after="0" w:line="240" w:lineRule="auto"/>
+        <w:rPr>
+          <w:lang w:bidi="ar-EG"/>
+        </w:rPr>
+      </w:pPr>
+      <w:r>
+        <w:rPr>
+          <w:lang w:bidi="ar-EG"/>
+        </w:rPr>
+        <w:t>From https://github.com/hzayed3030-cell/Concrete-design</w:t>
+      </w:r>
+    </w:p>
+    <w:p>
+      <w:pPr>
+        <w:bidi/>
+        <w:spacing w:after="0" w:line="240" w:lineRule="auto"/>
+        <w:rPr>
+          <w:lang w:bidi="ar-EG"/>
+        </w:rPr>
+      </w:pPr>
+      <w:r>
+        <w:rPr>
+          <w:lang w:bidi="ar-EG"/>
+        </w:rPr>
+        <w:t xml:space="preserve">   a789f</w:t>
+      </w:r>
+      <w:proofErr w:type="gramStart"/>
+      <w:r>
+        <w:rPr>
+          <w:lang w:bidi="ar-EG"/>
+        </w:rPr>
+        <w:t>64..</w:t>
+      </w:r>
+      <w:proofErr w:type="gramEnd"/>
+      <w:r>
+        <w:rPr>
+          <w:lang w:bidi="ar-EG"/>
+        </w:rPr>
+        <w:t>80ea8bc  main       -&gt; origin/main</w:t>
+      </w:r>
+    </w:p>
+    <w:p>
+      <w:pPr>
+        <w:bidi/>
+        <w:spacing w:after="0" w:line="240" w:lineRule="auto"/>
+        <w:rPr>
+          <w:lang w:bidi="ar-EG"/>
+        </w:rPr>
+      </w:pPr>
+      <w:r>
+        <w:rPr>
+          <w:lang w:bidi="ar-EG"/>
+        </w:rPr>
+        <w:t>Updating a789f</w:t>
+      </w:r>
+      <w:proofErr w:type="gramStart"/>
+      <w:r>
+        <w:rPr>
+          <w:lang w:bidi="ar-EG"/>
+        </w:rPr>
+        <w:t>64..</w:t>
+      </w:r>
+      <w:proofErr w:type="gramEnd"/>
+      <w:r>
+        <w:rPr>
+          <w:lang w:bidi="ar-EG"/>
+        </w:rPr>
+        <w:t>80ea8bc</w:t>
+      </w:r>
+    </w:p>
+    <w:p>
+      <w:pPr>
+        <w:bidi/>
+        <w:spacing w:after="0" w:line="240" w:lineRule="auto"/>
+        <w:rPr>
+          <w:lang w:bidi="ar-EG"/>
+        </w:rPr>
+      </w:pPr>
+      <w:r>
+        <w:rPr>
+          <w:lang w:bidi="ar-EG"/>
+        </w:rPr>
+        <w:t>error: Your local changes to the following files would be overwritten by merge:</w:t>
+      </w:r>
+    </w:p>
+    <w:p>
+      <w:pPr>
+        <w:bidi/>
+        <w:spacing w:after="0" w:line="240" w:lineRule="auto"/>
+        <w:rPr>
+          <w:lang w:bidi="ar-EG"/>
+        </w:rPr>
+      </w:pPr>
+      <w:r>
+        <w:rPr>
+          <w:lang w:bidi="ar-EG"/>
+        </w:rPr>
+        <w:t xml:space="preserve">        </w:t>
+      </w:r>
+      <w:proofErr w:type="gramStart"/>
+      <w:r>
+        <w:rPr>
+          <w:lang w:bidi="ar-EG"/>
+        </w:rPr>
+        <w:t>profiles.json</w:t>
+      </w:r>
+      <w:proofErr w:type="gramEnd"/>
+    </w:p>
+    <w:p>
+      <w:pPr>
+        <w:bidi/>
+        <w:spacing w:after="0" w:line="240" w:lineRule="auto"/>
+        <w:rPr>
+          <w:lang w:bidi="ar-EG"/>
+        </w:rPr>
+      </w:pPr>
+      <w:r>
+        <w:rPr>
+          <w:lang w:bidi="ar-EG"/>
+        </w:rPr>
+        <w:t xml:space="preserve">        profiles.json.bak</w:t>
+      </w:r>
+    </w:p>
+    <w:p>
+      <w:pPr>
+        <w:bidi/>
+        <w:spacing w:after="0" w:line="240" w:lineRule="auto"/>
+        <w:rPr>
+          <w:lang w:bidi="ar-EG"/>
+        </w:rPr>
+      </w:pPr>
+      <w:r>
+        <w:rPr>
+          <w:lang w:bidi="ar-EG"/>
+        </w:rPr>
+        <w:t>Please commit your changes or stash them before you merge.</w:t>
+      </w:r>
+    </w:p>
+    <w:p>
+      <w:pPr>
+        <w:bidi/>
+        <w:spacing w:after="0" w:line="240" w:lineRule="auto"/>
+        <w:rPr>
+          <w:lang w:bidi="ar-EG"/>
+        </w:rPr>
+      </w:pPr>
+      <w:r>
+        <w:rPr>
+          <w:lang w:bidi="ar-EG"/>
+        </w:rPr>
+        <w:t>Aborting</w:t>
+      </w:r>
+    </w:p>
+    <w:p>
+      <w:pPr>
+        <w:bidi/>
+        <w:spacing w:after="0" w:line="240" w:lineRule="auto"/>
+        <w:ind w:left="2160" w:firstLine="720"/>
+        <w:rPr>
+          <w:b/>
+          <w:bCs/>
+          <w:sz w:val="32"/>
+          <w:szCs w:val="32"/>
+          <w:u w:val="single"/>
+          <w:lang w:bidi="ar-EG"/>
+        </w:rPr>
+      </w:pPr>
+      <w:r>
+        <w:rPr>
+          <w:b/>
+          <w:bCs/>
+          <w:sz w:val="32"/>
+          <w:szCs w:val="32"/>
+          <w:u w:val="single"/>
+          <w:rtl/>
+        </w:rPr>
+        <w:lastRenderedPageBreak/>
+        <w:t>الحل</w:t>
+      </w:r>
+    </w:p>
+    <w:p>
+      <w:pPr>
+        <w:bidi/>
+        <w:spacing w:after="0" w:line="240" w:lineRule="auto"/>
+        <w:rPr>
+          <w:lang w:bidi="ar-EG"/>
+        </w:rPr>
+      </w:pPr>
+    </w:p>
+    <w:p>
+      <w:pPr>
+        <w:bidi/>
+        <w:spacing w:after="0" w:line="240" w:lineRule="auto"/>
+        <w:rPr>
+          <w:lang w:bidi="ar-EG"/>
+        </w:rPr>
+      </w:pPr>
+      <w:r>
+        <w:rPr>
+          <w:rtl/>
+        </w:rPr>
+        <w:t>السبب ان هناك تعديلات تلقائية هذا الجهاز هو مجرد تحديث طفيف لوقت الفتح</w:t>
+      </w:r>
+    </w:p>
+    <w:p>
+      <w:pPr>
+        <w:bidi/>
+        <w:spacing w:after="0" w:line="240" w:lineRule="auto"/>
+        <w:rPr>
+          <w:lang w:bidi="ar-EG"/>
+        </w:rPr>
+      </w:pPr>
+      <w:r>
+        <w:rPr>
+          <w:rtl/>
+        </w:rPr>
+        <w:t>الحل</w:t>
+      </w:r>
+      <w:r>
+        <w:rPr>
+          <w:lang w:bidi="ar-EG"/>
+        </w:rPr>
+        <w:t>:-</w:t>
+      </w:r>
+    </w:p>
+    <w:p>
+      <w:pPr>
+        <w:bidi/>
+        <w:spacing w:after="0" w:line="240" w:lineRule="auto"/>
+        <w:rPr>
+          <w:lang w:bidi="ar-EG"/>
+        </w:rPr>
+      </w:pPr>
+      <w:r>
+        <w:rPr>
+          <w:rtl/>
+        </w:rPr>
+        <w:t>من شاشة ال</w:t>
+      </w:r>
+      <w:r>
+        <w:rPr>
+          <w:lang w:bidi="ar-EG"/>
+        </w:rPr>
+        <w:t xml:space="preserve"> Cmd  </w:t>
+      </w:r>
+      <w:r>
+        <w:rPr>
+          <w:rtl/>
+        </w:rPr>
+        <w:t>اكتب الاوامر</w:t>
+      </w:r>
+    </w:p>
+    <w:p>
+      <w:pPr>
+        <w:bidi/>
+        <w:spacing w:after="0" w:line="240" w:lineRule="auto"/>
+        <w:rPr>
+          <w:lang w:bidi="ar-EG"/>
+        </w:rPr>
+      </w:pPr>
+    </w:p>
+    <w:p>
+      <w:pPr>
+        <w:spacing w:after="0" w:line="240" w:lineRule="auto"/>
+        <w:rPr>
+          <w:b/>
+          <w:bCs/>
+          <w:color w:val="0070C0"/>
+          <w:sz w:val="28"/>
+          <w:szCs w:val="28"/>
+          <w:lang w:bidi="ar-EG"/>
+        </w:rPr>
+      </w:pPr>
+      <w:r>
+        <w:rPr>
+          <w:b/>
+          <w:bCs/>
+          <w:color w:val="0070C0"/>
+          <w:sz w:val="28"/>
+          <w:szCs w:val="28"/>
+          <w:lang w:bidi="ar-EG"/>
+        </w:rPr>
+        <w:t xml:space="preserve">git restore </w:t>
+      </w:r>
+      <w:proofErr w:type="gramStart"/>
+      <w:r>
+        <w:rPr>
+          <w:b/>
+          <w:bCs/>
+          <w:color w:val="0070C0"/>
+          <w:sz w:val="28"/>
+          <w:szCs w:val="28"/>
+          <w:lang w:bidi="ar-EG"/>
+        </w:rPr>
+        <w:t>profiles.json</w:t>
+      </w:r>
+      <w:proofErr w:type="gramEnd"/>
+      <w:r>
+        <w:rPr>
+          <w:b/>
+          <w:bCs/>
+          <w:color w:val="0070C0"/>
+          <w:sz w:val="28"/>
+          <w:szCs w:val="28"/>
+          <w:lang w:bidi="ar-EG"/>
+        </w:rPr>
+        <w:t xml:space="preserve"> profiles.json.bak</w:t>
+      </w:r>
+    </w:p>
+    <w:p>
+      <w:pPr>
+        <w:spacing w:after="0" w:line="240" w:lineRule="auto"/>
+        <w:rPr>
+          <w:b/>
+          <w:bCs/>
+          <w:color w:val="0070C0"/>
+          <w:sz w:val="28"/>
+          <w:szCs w:val="28"/>
+          <w:lang w:bidi="ar-EG"/>
+        </w:rPr>
+      </w:pPr>
+      <w:r>
+        <w:rPr>
+          <w:b/>
+          <w:bCs/>
+          <w:color w:val="0070C0"/>
+          <w:sz w:val="28"/>
+          <w:szCs w:val="28"/>
+          <w:lang w:bidi="ar-EG"/>
+        </w:rPr>
+        <w:t xml:space="preserve">git </w:t>
+      </w:r>
+      <w:proofErr w:type="gramStart"/>
+      <w:r>
+        <w:rPr>
+          <w:b/>
+          <w:bCs/>
+          <w:color w:val="0070C0"/>
+          <w:sz w:val="28"/>
+          <w:szCs w:val="28"/>
+          <w:lang w:bidi="ar-EG"/>
+        </w:rPr>
+        <w:t>pull</w:t>
+      </w:r>
+      <w:proofErr w:type="gramEnd"/>
+    </w:p>
+    <w:p>
+      <w:pPr>
+        <w:spacing w:after="0" w:line="240" w:lineRule="auto"/>
+        <w:rPr>
+          <w:lang w:bidi="ar-EG"/>
+        </w:rPr>
+      </w:pPr>
+    </w:p>
+    <w:p>
+      <w:pPr>
+        <w:bidi/>
+        <w:spacing w:after="0" w:line="240" w:lineRule="auto"/>
+        <w:jc w:val="center"/>
+        <w:rPr>
+          <w:b/>
+          <w:bCs/>
+          <w:sz w:val="40"/>
+          <w:szCs w:val="40"/>
+          <w:highlight w:val="green"/>
+          <w:u w:val="single"/>
+          <w:rtl/>
+          <w:lang w:bidi="ar-EG"/>
+        </w:rPr>
+      </w:pPr>
+      <w:r>
+        <w:rPr>
+          <w:b/>
+          <w:bCs/>
+          <w:sz w:val="40"/>
+          <w:szCs w:val="40"/>
+          <w:highlight w:val="green"/>
+          <w:u w:val="single"/>
+          <w:lang w:bidi="ar-EG"/>
+        </w:rPr>
+        <w:t>git clone</w:t>
+      </w:r>
+    </w:p>
+    <w:p>
+      <w:pPr>
+        <w:bidi/>
+        <w:spacing w:after="0" w:line="240" w:lineRule="auto"/>
+        <w:jc w:val="center"/>
+        <w:rPr>
+          <w:b/>
+          <w:bCs/>
+          <w:sz w:val="40"/>
+          <w:szCs w:val="40"/>
+          <w:highlight w:val="green"/>
+          <w:u w:val="single"/>
+          <w:lang w:bidi="ar-EG"/>
+        </w:rPr>
+      </w:pPr>
+    </w:p>
+    <w:p>
+      <w:pPr>
+        <w:bidi/>
+        <w:spacing w:after="0" w:line="240" w:lineRule="auto"/>
+        <w:rPr>
+          <w:rtl/>
+          <w:lang w:bidi="ar-EG"/>
+        </w:rPr>
+      </w:pPr>
+      <w:r>
+        <w:rPr>
+          <w:rFonts w:hint="cs"/>
+          <w:rtl/>
+          <w:lang w:bidi="ar-EG"/>
+        </w:rPr>
+        <w:t xml:space="preserve">توضيح : يتم عمل </w:t>
+      </w:r>
+      <w:r>
+        <w:rPr>
+          <w:lang w:bidi="ar-EG"/>
+        </w:rPr>
+        <w:t>Git clone</w:t>
+      </w:r>
+      <w:r>
+        <w:rPr>
+          <w:rFonts w:hint="cs"/>
+          <w:rtl/>
+          <w:lang w:bidi="ar-EG"/>
+        </w:rPr>
+        <w:t xml:space="preserve"> علي فولدر فارغ تماما مثلا نقف علي </w:t>
+      </w:r>
+      <w:r>
+        <w:rPr>
+          <w:lang w:bidi="ar-EG"/>
+        </w:rPr>
+        <w:t>E</w:t>
+      </w:r>
+      <w:r>
+        <w:rPr>
+          <w:rFonts w:hint="cs"/>
+          <w:rtl/>
+          <w:lang w:bidi="ar-EG"/>
+        </w:rPr>
+        <w:t xml:space="preserve"> </w:t>
+      </w:r>
+      <w:r>
+        <w:rPr>
+          <w:rtl/>
+          <w:lang w:bidi="ar-EG"/>
+        </w:rPr>
+        <w:br/>
+      </w:r>
+    </w:p>
+    <w:p>
+      <w:pPr>
+        <w:bidi/>
+        <w:spacing w:after="0" w:line="240" w:lineRule="auto"/>
+        <w:rPr>
+          <w:u w:val="single"/>
+          <w:rtl/>
+          <w:lang w:bidi="ar-EG"/>
+        </w:rPr>
+      </w:pPr>
+      <w:r>
+        <w:rPr>
+          <w:rFonts w:hint="cs"/>
+          <w:u w:val="single"/>
+          <w:rtl/>
+          <w:lang w:bidi="ar-EG"/>
+        </w:rPr>
+        <w:t>- نكتب الامر</w:t>
+      </w:r>
+    </w:p>
+    <w:p>
+      <w:pPr>
+        <w:bidi/>
+        <w:spacing w:after="0" w:line="240" w:lineRule="auto"/>
+        <w:rPr>
+          <w:lang w:bidi="ar-EG"/>
+        </w:rPr>
+      </w:pPr>
+      <w:r>
+        <w:rPr>
+          <w:lang w:bidi="ar-EG"/>
+        </w:rPr>
+        <w:t>E:\ Git clone http:\hgsagchg gagag ghgg dhgdg</w:t>
+      </w:r>
+    </w:p>
+    <w:p>
+      <w:pPr>
+        <w:bidi/>
+        <w:spacing w:after="0" w:line="240" w:lineRule="auto"/>
+        <w:rPr>
+          <w:rtl/>
+          <w:lang w:bidi="ar-EG"/>
+        </w:rPr>
+      </w:pPr>
+      <w:r>
+        <w:rPr>
+          <w:rFonts w:hint="cs"/>
+          <w:rtl/>
+          <w:lang w:bidi="ar-EG"/>
+        </w:rPr>
+        <w:t xml:space="preserve">سطر </w:t>
+      </w:r>
+      <w:r>
+        <w:rPr>
+          <w:lang w:bidi="ar-EG"/>
+        </w:rPr>
+        <w:t xml:space="preserve">Http”\ </w:t>
+      </w:r>
+      <w:r>
+        <w:rPr>
+          <w:rFonts w:hint="cs"/>
+          <w:rtl/>
+          <w:lang w:bidi="ar-EG"/>
+        </w:rPr>
+        <w:t xml:space="preserve">  يتم اخذه نسخ من منصة </w:t>
+      </w:r>
+      <w:r>
+        <w:rPr>
+          <w:lang w:bidi="ar-EG"/>
+        </w:rPr>
+        <w:t>git hub</w:t>
+      </w:r>
+      <w:r>
+        <w:rPr>
+          <w:rFonts w:hint="cs"/>
+          <w:rtl/>
+          <w:lang w:bidi="ar-EG"/>
+        </w:rPr>
+        <w:t xml:space="preserve"> بعد الوقوف علي اسم المشروع ثم من زر </w:t>
+      </w:r>
+      <w:r>
+        <w:rPr>
+          <w:lang w:bidi="ar-EG"/>
+        </w:rPr>
+        <w:t>code</w:t>
+      </w:r>
+      <w:r>
+        <w:rPr>
+          <w:rFonts w:hint="cs"/>
+          <w:rtl/>
+          <w:lang w:bidi="ar-EG"/>
+        </w:rPr>
+        <w:t xml:space="preserve"> باللون الاخضر</w:t>
+      </w:r>
+      <w:r>
+        <w:rPr>
+          <w:rtl/>
+          <w:lang w:bidi="ar-EG"/>
+        </w:rPr>
+        <w:br/>
+      </w:r>
+    </w:p>
+    <w:p>
+      <w:pPr>
+        <w:bidi/>
+        <w:spacing w:after="0" w:line="240" w:lineRule="auto"/>
+        <w:rPr>
+          <w:lang w:bidi="ar-EG"/>
+        </w:rPr>
+      </w:pPr>
+      <w:r>
+        <w:rPr>
+          <w:rFonts w:hint="cs"/>
+          <w:b/>
+          <w:bCs/>
+          <w:rtl/>
+          <w:lang w:bidi="ar-EG"/>
+        </w:rPr>
+        <w:t xml:space="preserve">- نطلب من </w:t>
+      </w:r>
+      <w:r>
+        <w:rPr>
+          <w:b/>
+          <w:bCs/>
+          <w:lang w:bidi="ar-EG"/>
+        </w:rPr>
+        <w:t>AntiGravity</w:t>
+      </w:r>
+      <w:r>
+        <w:rPr>
+          <w:rFonts w:hint="cs"/>
+          <w:b/>
+          <w:bCs/>
+          <w:rtl/>
+          <w:lang w:bidi="ar-EG"/>
+        </w:rPr>
+        <w:t xml:space="preserve"> ان يعمل </w:t>
+      </w:r>
+      <w:r>
+        <w:rPr>
+          <w:b/>
+          <w:bCs/>
+          <w:lang w:bidi="ar-EG"/>
+        </w:rPr>
+        <w:t>install Dependencies</w:t>
+      </w:r>
+      <w:r>
+        <w:rPr>
+          <w:b/>
+          <w:bCs/>
+          <w:lang w:bidi="ar-EG"/>
+        </w:rPr>
+        <w:br/>
+      </w:r>
+      <w:r>
+        <w:rPr>
+          <w:rFonts w:hint="cs"/>
+          <w:b/>
+          <w:bCs/>
+          <w:rtl/>
+          <w:lang w:bidi="ar-EG"/>
+        </w:rPr>
+        <w:t xml:space="preserve">- نطلب من </w:t>
+      </w:r>
+      <w:r>
+        <w:rPr>
+          <w:b/>
+          <w:bCs/>
+          <w:lang w:bidi="ar-EG"/>
+        </w:rPr>
+        <w:t>AntiGravity</w:t>
+      </w:r>
+      <w:r>
+        <w:rPr>
+          <w:rFonts w:hint="cs"/>
+          <w:b/>
+          <w:bCs/>
+          <w:rtl/>
+          <w:lang w:bidi="ar-EG"/>
+        </w:rPr>
+        <w:t xml:space="preserve"> ان يعطينا امر تشغيل البرنامج</w:t>
+      </w:r>
+      <w:r>
+        <w:rPr>
+          <w:lang w:bidi="ar-EG"/>
+        </w:rPr>
+        <w:br/>
+      </w:r>
+    </w:p>
+    <w:p>
+      <w:pPr>
+        <w:bidi/>
+        <w:spacing w:after="0" w:line="240" w:lineRule="auto"/>
+        <w:rPr>
           <w:lang w:bidi="ar-EG"/>
         </w:rPr>
       </w:pPr>
@@ -2579,7 +3574,7 @@
 </file>
 
 <file path=word/numbering.xml><?xml version="1.0" encoding="utf-8"?>
-<w:numbering xmlns:wpc="http://schemas.microsoft.com/office/word/2010/wordprocessingCanvas" xmlns:cx="http://schemas.microsoft.com/office/drawing/2014/chartex" xmlns:cx1="http://schemas.microsoft.com/office/drawing/2015/9/8/chartex" xmlns:cx2="http://schemas.microsoft.com/office/drawing/2015/10/21/chartex" xmlns:cx3="http://schemas.microsoft.com/office/drawing/2016/5/9/chartex" xmlns:cx4="http://schemas.microsoft.com/office/drawing/2016/5/10/chartex" xmlns:cx5="http://schemas.microsoft.com/office/drawing/2016/5/11/chartex" xmlns:cx6="http://schemas.microsoft.com/office/drawing/2016/5/12/chartex" xmlns:cx7="http://schemas.microsoft.com/office/drawing/2016/5/13/chartex" xmlns:cx8="http://schemas.microsoft.com/office/drawing/2016/5/14/chartex" xmlns:mc="http://schemas.openxmlformats.org/markup-compatibility/2006" xmlns:aink="http://schemas.microsoft.com/office/drawing/2016/ink" xmlns:am3d="http://schemas.microsoft.com/office/drawing/2017/model3d" xmlns:o="urn:schemas-microsoft-com:office:office" xmlns:oel="http://schemas.microsoft.com/office/2019/extlst" xmlns:r="http://schemas.openxmlformats.org/officeDocument/2006/relationships" xmlns:m="http://schemas.openxmlformats.org/officeDocument/2006/math" xmlns:v="urn:schemas-microsoft-com:vml" xmlns:wp14="http://schemas.microsoft.com/office/word/2010/wordprocessingDrawing" xmlns:wp="http://schemas.openxmlformats.org/drawingml/2006/wordprocessingDrawing" xmlns:w10="urn:schemas-microsoft-com:office:word" xmlns:w="http://schemas.openxmlformats.org/wordprocessingml/2006/main" xmlns:w14="http://schemas.microsoft.com/office/word/2010/wordml" xmlns:w15="http://schemas.microsoft.com/office/word/2012/wordml" xmlns:w16cex="http://schemas.microsoft.com/office/word/2018/wordml/cex" xmlns:w16cid="http://schemas.microsoft.com/office/word/2016/wordml/cid" xmlns:w16="http://schemas.microsoft.com/office/word/2018/wordml" xmlns:w16du="http://schemas.microsoft.com/office/word/2023/wordml/word16du" xmlns:w16sdtdh="http://schemas.microsoft.com/office/word/2020/wordml/sdtdatahash" xmlns:w16sdtfl="http://schemas.microsoft.com/office/word/2024/wordml/sdtformatlock" xmlns:w16se="http://schemas.microsoft.com/office/word/2015/wordml/symex" xmlns:wpg="http://schemas.microsoft.com/office/word/2010/wordprocessingGroup" xmlns:wpi="http://schemas.microsoft.com/office/word/2010/wordprocessingInk" xmlns:wne="http://schemas.microsoft.com/office/word/2006/wordml" xmlns:wps="http://schemas.microsoft.com/office/word/2010/wordprocessingShape" mc:Ignorable="w14 w15 w16se w16cid w16 w16cex w16sdtdh w16sdtfl w16du wp14">
+<w:numbering xmlns:wpc="http://schemas.microsoft.com/office/word/2010/wordprocessingCanvas" xmlns:cx="http://schemas.microsoft.com/office/drawing/2014/chartex" xmlns:cx1="http://schemas.microsoft.com/office/drawing/2015/9/8/chartex" xmlns:cx2="http://schemas.microsoft.com/office/drawing/2015/10/21/chartex" xmlns:cx3="http://schemas.microsoft.com/office/drawing/2016/5/9/chartex" xmlns:cx4="http://schemas.microsoft.com/office/drawing/2016/5/10/chartex" xmlns:cx5="http://schemas.microsoft.com/office/drawing/2016/5/11/chartex" xmlns:cx6="http://schemas.microsoft.com/office/drawing/2016/5/12/chartex" xmlns:cx7="http://schemas.microsoft.com/office/drawing/2016/5/13/chartex" xmlns:cx8="http://schemas.microsoft.com/office/drawing/2016/5/14/chartex" xmlns:mc="http://schemas.openxmlformats.org/markup-compatibility/2006" xmlns:aink="http://schemas.microsoft.com/office/drawing/2016/ink" xmlns:am3d="http://schemas.microsoft.com/office/drawing/2017/model3d" xmlns:o="urn:schemas-microsoft-com:office:office" xmlns:r="http://schemas.openxmlformats.org/officeDocument/2006/relationships" xmlns:m="http://schemas.openxmlformats.org/officeDocument/2006/math" xmlns:v="urn:schemas-microsoft-com:vml" xmlns:wp14="http://schemas.microsoft.com/office/word/2010/wordprocessingDrawing" xmlns:wp="http://schemas.openxmlformats.org/drawingml/2006/wordprocessingDrawing" xmlns:w10="urn:schemas-microsoft-com:office:word" xmlns:w="http://schemas.openxmlformats.org/wordprocessingml/2006/main" xmlns:w14="http://schemas.microsoft.com/office/word/2010/wordml" xmlns:w15="http://schemas.microsoft.com/office/word/2012/wordml" xmlns:w16cex="http://schemas.microsoft.com/office/word/2018/wordml/cex" xmlns:w16cid="http://schemas.microsoft.com/office/word/2016/wordml/cid" xmlns:w16="http://schemas.microsoft.com/office/word/2018/wordml" xmlns:w16sdtdh="http://schemas.microsoft.com/office/word/2020/wordml/sdtdatahash" xmlns:w16se="http://schemas.microsoft.com/office/word/2015/wordml/symex" xmlns:wpg="http://schemas.microsoft.com/office/word/2010/wordprocessingGroup" xmlns:wpi="http://schemas.microsoft.com/office/word/2010/wordprocessingInk" xmlns:wne="http://schemas.microsoft.com/office/word/2006/wordml" xmlns:wps="http://schemas.microsoft.com/office/word/2010/wordprocessingShape" mc:Ignorable="w14 w15 w16se w16cid w16 w16cex w16sdtdh wp14">
   <w:abstractNum w:abstractNumId="0" w15:restartNumberingAfterBreak="0">
     <w:nsid w:val="12E74F33"/>
     <w:multiLevelType w:val="hybridMultilevel"/>
@@ -2693,14 +3688,14 @@
       </w:rPr>
     </w:lvl>
   </w:abstractNum>
-  <w:num w:numId="1" w16cid:durableId="1746298648">
+  <w:num w:numId="1">
     <w:abstractNumId w:val="0"/>
   </w:num>
 </w:numbering>
 </file>
 
 <file path=word/styles.xml><?xml version="1.0" encoding="utf-8"?>
-<w:styles xmlns:mc="http://schemas.openxmlformats.org/markup-compatibility/2006" xmlns:r="http://schemas.openxmlformats.org/officeDocument/2006/relationships" xmlns:w="http://schemas.openxmlformats.org/wordprocessingml/2006/main" xmlns:w14="http://schemas.microsoft.com/office/word/2010/wordml" xmlns:w15="http://schemas.microsoft.com/office/word/2012/wordml" xmlns:w16cex="http://schemas.microsoft.com/office/word/2018/wordml/cex" xmlns:w16cid="http://schemas.microsoft.com/office/word/2016/wordml/cid" xmlns:w16="http://schemas.microsoft.com/office/word/2018/wordml" xmlns:w16du="http://schemas.microsoft.com/office/word/2023/wordml/word16du" xmlns:w16sdtdh="http://schemas.microsoft.com/office/word/2020/wordml/sdtdatahash" xmlns:w16sdtfl="http://schemas.microsoft.com/office/word/2024/wordml/sdtformatlock" xmlns:w16se="http://schemas.microsoft.com/office/word/2015/wordml/symex" mc:Ignorable="w14 w15 w16se w16cid w16 w16cex w16sdtdh w16sdtfl w16du">
+<w:styles xmlns:mc="http://schemas.openxmlformats.org/markup-compatibility/2006" xmlns:r="http://schemas.openxmlformats.org/officeDocument/2006/relationships" xmlns:w="http://schemas.openxmlformats.org/wordprocessingml/2006/main" xmlns:w14="http://schemas.microsoft.com/office/word/2010/wordml" xmlns:w15="http://schemas.microsoft.com/office/word/2012/wordml" xmlns:w16cex="http://schemas.microsoft.com/office/word/2018/wordml/cex" xmlns:w16cid="http://schemas.microsoft.com/office/word/2016/wordml/cid" xmlns:w16="http://schemas.microsoft.com/office/word/2018/wordml" xmlns:w16sdtdh="http://schemas.microsoft.com/office/word/2020/wordml/sdtdatahash" xmlns:w16se="http://schemas.microsoft.com/office/word/2015/wordml/symex" mc:Ignorable="w14 w15 w16se w16cid w16 w16cex w16sdtdh">
   <w:docDefaults>
     <w:rPrDefault>
       <w:rPr>
@@ -3102,7 +4097,6 @@
   <w:style w:type="character" w:default="1" w:styleId="DefaultParagraphFont">
     <w:name w:val="Default Paragraph Font"/>
     <w:uiPriority w:val="1"/>
-    <w:semiHidden/>
     <w:unhideWhenUsed/>
   </w:style>
   <w:style w:type="table" w:default="1" w:styleId="TableNormal">

</xml_diff>